<commit_message>
Update LTspice circuit document
Refresh the LTspice circuit documentation for the acoustic phased-array system to reflect the latest circuit revisions and design notes.
</commit_message>
<xml_diff>
--- a/simulation/LTSpice/Circuits.docx
+++ b/simulation/LTSpice/Circuits.docx
@@ -25,10 +25,10 @@
           <w:noProof/>
         </w:rPr>
         <w:drawing>
-          <wp:inline distT="0" distB="0" distL="0" distR="0" wp14:anchorId="2D31C53B" wp14:editId="0F422B0F">
-            <wp:extent cx="5731510" cy="3022600"/>
+          <wp:inline distT="0" distB="0" distL="0" distR="0" wp14:anchorId="7173AC7E" wp14:editId="2E676857">
+            <wp:extent cx="5731510" cy="2679700"/>
             <wp:effectExtent l="0" t="0" r="2540" b="6350"/>
-            <wp:docPr id="1735916438" name="Picture 1"/>
+            <wp:docPr id="977940996" name="Picture 1"/>
             <wp:cNvGraphicFramePr>
               <a:graphicFrameLocks xmlns:a="http://schemas.openxmlformats.org/drawingml/2006/main" noChangeAspect="1"/>
             </wp:cNvGraphicFramePr>
@@ -36,7 +36,7 @@
               <a:graphicData uri="http://schemas.openxmlformats.org/drawingml/2006/picture">
                 <pic:pic xmlns:pic="http://schemas.openxmlformats.org/drawingml/2006/picture">
                   <pic:nvPicPr>
-                    <pic:cNvPr id="1735916438" name=""/>
+                    <pic:cNvPr id="977940996" name=""/>
                     <pic:cNvPicPr/>
                   </pic:nvPicPr>
                   <pic:blipFill>
@@ -48,7 +48,7 @@
                   <pic:spPr>
                     <a:xfrm>
                       <a:off x="0" y="0"/>
-                      <a:ext cx="5731510" cy="3022600"/>
+                      <a:ext cx="5731510" cy="2679700"/>
                     </a:xfrm>
                     <a:prstGeom prst="rect">
                       <a:avLst/>
@@ -67,10 +67,10 @@
           <w:noProof/>
         </w:rPr>
         <w:drawing>
-          <wp:inline distT="0" distB="0" distL="0" distR="0" wp14:anchorId="537534E3" wp14:editId="5DA6BBC2">
+          <wp:inline distT="0" distB="0" distL="0" distR="0" wp14:anchorId="4D63E11D" wp14:editId="46A39875">
             <wp:extent cx="5731510" cy="1340485"/>
             <wp:effectExtent l="0" t="0" r="2540" b="0"/>
-            <wp:docPr id="1298221581" name="Picture 1"/>
+            <wp:docPr id="159326597" name="Picture 1"/>
             <wp:cNvGraphicFramePr>
               <a:graphicFrameLocks xmlns:a="http://schemas.openxmlformats.org/drawingml/2006/main" noChangeAspect="1"/>
             </wp:cNvGraphicFramePr>
@@ -78,7 +78,7 @@
               <a:graphicData uri="http://schemas.openxmlformats.org/drawingml/2006/picture">
                 <pic:pic xmlns:pic="http://schemas.openxmlformats.org/drawingml/2006/picture">
                   <pic:nvPicPr>
-                    <pic:cNvPr id="1298221581" name=""/>
+                    <pic:cNvPr id="159326597" name=""/>
                     <pic:cNvPicPr/>
                   </pic:nvPicPr>
                   <pic:blipFill>
@@ -183,6 +183,7 @@
           <w:rFonts w:ascii="Times New Roman" w:hAnsi="Times New Roman" w:cs="Times New Roman"/>
           <w:b/>
           <w:bCs/>
+          <w:noProof/>
         </w:rPr>
         <w:lastRenderedPageBreak/>
         <w:drawing>

</xml_diff>